<commit_message>
Fix copy-optimal region in the results report when ACT has no region
Co-Authored-By: Claude Opus 5.5 <noreply@anthropic.com>
Claude-Session: https://claude.ai/code/session_015CqwY2bd2LQVGUGGRgsEHh
</commit_message>
<xml_diff>
--- a/results/RESULTS_pairs.docx
+++ b/results/RESULTS_pairs.docx
@@ -2879,7 +2879,7 @@
                 <w:sz w:val="18"/>
                 <w:szCs w:val="18"/>
               </w:rPr>
-              <w:t xml:space="preserve">–</w:t>
+              <w:t xml:space="preserve">v &lt; 44.39</w:t>
             </w:r>
           </w:p>
         </w:tc>
@@ -3098,7 +3098,7 @@
                 <w:sz w:val="18"/>
                 <w:szCs w:val="18"/>
               </w:rPr>
-              <w:t xml:space="preserve">–</w:t>
+              <w:t xml:space="preserve">v &lt; 40.91</w:t>
             </w:r>
           </w:p>
         </w:tc>
@@ -3536,7 +3536,7 @@
                 <w:sz w:val="18"/>
                 <w:szCs w:val="18"/>
               </w:rPr>
-              <w:t xml:space="preserve">–</w:t>
+              <w:t xml:space="preserve">v &lt; 8.26</w:t>
             </w:r>
           </w:p>
         </w:tc>
@@ -3755,7 +3755,7 @@
                 <w:sz w:val="18"/>
                 <w:szCs w:val="18"/>
               </w:rPr>
-              <w:t xml:space="preserve">–</w:t>
+              <w:t xml:space="preserve">v &lt; 6.64</w:t>
             </w:r>
           </w:p>
         </w:tc>

</xml_diff>